<commit_message>
Harden redesigned app for production
</commit_message>
<xml_diff>
--- a/docs/AUTOFLEX_SYSTEM_DESIGN.docx
+++ b/docs/AUTOFLEX_SYSTEM_DESIGN.docx
@@ -706,7 +706,7 @@
         </w:rPr>
       </w:pPr>
       <w:r>
-        <w:t>Autoflex is a responsive React and Vite web application for vehicle ownership, purchase comparison, service records, and owner evidence. The client is intentionally usable without a hosted account and stores current user state in the browser.</w:t>
+        <w:t>Autoflex is a responsive React and Vite web application for vehicle ownership, purchase comparison, service records, and owner evidence. The client is intentionally usable without a hosted account, stores current user state in the browser, and ships a generated service worker that precaches the exact production app shell.</w:t>
       </w:r>
     </w:p>
     <w:p>
@@ -1781,7 +1781,7 @@
           </w:tcPr>
           <w:p>
             <w:r>
-              <w:t>Deployment</w:t>
+              <w:t>Deployment + offline shell</w:t>
             </w:r>
           </w:p>
         </w:tc>
@@ -1804,7 +1804,7 @@
           </w:tcPr>
           <w:p>
             <w:r>
-              <w:t>Serve client and configured API runtime</w:t>
+              <w:t>Serve client, headers, and versioned cache</w:t>
             </w:r>
           </w:p>
         </w:tc>
@@ -1827,7 +1827,7 @@
           </w:tcPr>
           <w:p>
             <w:r>
-              <w:t>Vercel plus API host</w:t>
+              <w:t>Vercel plus browser Cache API</w:t>
             </w:r>
           </w:p>
         </w:tc>
@@ -1850,7 +1850,7 @@
           </w:tcPr>
           <w:p>
             <w:r>
-              <w:t>Status checks block promotion</w:t>
+              <w:t>Last valid shell remains available offline</w:t>
             </w:r>
           </w:p>
         </w:tc>
@@ -1923,7 +1923,7 @@
         </w:rPr>
       </w:pPr>
       <w:r>
-        <w:t>1. The app boots from the Vite bundle and hydrates profile, garage, shortlist, notes, and preference state from browser storage.</w:t>
+        <w:t>1. The generated service worker serves the versioned app shell when available; the Vite bundle then hydrates profile, garage, shortlist, notes, and preference state from browser storage.</w:t>
       </w:r>
     </w:p>
     <w:p>
@@ -3719,7 +3719,7 @@
         </w:rPr>
       </w:pPr>
       <w:r>
-        <w:t>Secrets belong in deployment environment variables and must never be committed, embedded in the Vite bundle, or written to product documentation.</w:t>
+        <w:t>Secrets belong in deployment environment variables and must never be committed, embedded in the Vite bundle, or written to product documentation. Vercel headers restrict framing, origins, capabilities, and executable content.</w:t>
       </w:r>
     </w:p>
     <w:p>
@@ -4040,7 +4040,7 @@
           </w:tcPr>
           <w:p>
             <w:r>
-              <w:t>All tests and production build pass</w:t>
+              <w:t>Tests, build, and server-offline reload pass</w:t>
             </w:r>
           </w:p>
         </w:tc>
@@ -5321,7 +5321,7 @@
           </w:tcPr>
           <w:p>
             <w:r>
-              <w:t>Tests, build, accessibility, and responsive QA pass</w:t>
+              <w:t>Tests, build, offline reload, accessibility, and responsive QA pass</w:t>
             </w:r>
           </w:p>
         </w:tc>

</xml_diff>